<commit_message>
docs: update week 1 report after supervisor feedback
</commit_message>
<xml_diff>
--- a/docs/reports/week-1/OOP_Week1_ProgressReport_Elearning.docx
+++ b/docs/reports/week-1/OOP_Week1_ProgressReport_Elearning.docx
@@ -2134,7 +2134,7 @@
           <w:i w:val="0"/>
           <w:sz w:val="26"/>
         </w:rPr>
-        <w:t>- Repository sẽ được khởi tạo sau khi cả hai thành viên xác nhận bản thiết kế Week 1.</w:t>
+        <w:t>- Repository đã được khởi tạo tại: https://github.com/TuanKhaUTE/oop-elearning-platform</w:t>
       </w:r>
     </w:p>
     <w:p>
@@ -2451,7 +2451,7 @@
                 <w:i w:val="0"/>
                 <w:sz w:val="21"/>
               </w:rPr>
-              <w:t>Course, Lesson hierarchy, VideoLesson, TextLesson, QuizLesson, prerequisite logic</w:t>
+              <w:t>Course, Lesson hierarchy (Video/Text/Quiz), CompletionEvidence, Instructor, prerequisite definition</w:t>
             </w:r>
           </w:p>
         </w:tc>
@@ -2551,7 +2551,7 @@
                 <w:i w:val="0"/>
                 <w:sz w:val="21"/>
               </w:rPr>
-              <w:t>Student, Instructor, Enrollment, Progress, progress percentage, certificate eligibility</w:t>
+              <w:t>Student, Enrollment, Progress, progress percentage, prerequisite enforcement, certificate eligibility</w:t>
             </w:r>
           </w:p>
         </w:tc>
@@ -2628,7 +2628,7 @@
           <w:i w:val="0"/>
           <w:sz w:val="26"/>
         </w:rPr>
-        <w:t>- Khởi tạo GitHub repository và project Java sau khi chốt thiết kế.</w:t>
+        <w:t>- Bắt đầu implementation trên các feature branch riêng sau khi repository và workflow đã được thiết lập.</w:t>
       </w:r>
     </w:p>
     <w:p>
@@ -3011,6 +3011,112 @@
           </w:p>
         </w:tc>
       </w:tr>
+      <w:tr>
+        <w:tc>
+          <w:tcPr>
+            <w:tcW w:w="2267" w:type="dxa"/>
+            <w:tcMar>
+              <w:top w:w="80" w:type="dxa"/>
+              <w:left w:w="100" w:type="dxa"/>
+              <w:bottom w:w="80" w:type="dxa"/>
+              <w:right w:w="100" w:type="dxa"/>
+            </w:tcMar>
+            <w:vAlign w:val="center"/>
+          </w:tcPr>
+          <w:p>
+            <w:pPr>
+              <w:spacing w:after="0" w:line="276" w:lineRule="auto"/>
+            </w:pPr>
+            <w:r>
+              <w:rPr>
+                <w:rFonts w:ascii="Times New Roman" w:hAnsi="Times New Roman" w:eastAsia="Times New Roman"/>
+                <w:b w:val="0"/>
+                <w:i w:val="0"/>
+                <w:sz w:val="20"/>
+              </w:rPr>
+              <w:t>11/10/2026</w:t>
+            </w:r>
+          </w:p>
+        </w:tc>
+        <w:tc>
+          <w:tcPr>
+            <w:tcW w:w="2267" w:type="dxa"/>
+            <w:tcMar>
+              <w:top w:w="80" w:type="dxa"/>
+              <w:left w:w="100" w:type="dxa"/>
+              <w:bottom w:w="80" w:type="dxa"/>
+              <w:right w:w="100" w:type="dxa"/>
+            </w:tcMar>
+            <w:vAlign w:val="center"/>
+          </w:tcPr>
+          <w:p>
+            <w:pPr>
+              <w:spacing w:after="0" w:line="276" w:lineRule="auto"/>
+            </w:pPr>
+            <w:r>
+              <w:rPr>
+                <w:rFonts w:ascii="Times New Roman" w:hAnsi="Times New Roman" w:eastAsia="Times New Roman"/>
+                <w:b w:val="0"/>
+                <w:i w:val="0"/>
+                <w:sz w:val="20"/>
+              </w:rPr>
+              <w:t>Cập nhật báo cáo theo phản hồi GVHD</w:t>
+            </w:r>
+          </w:p>
+        </w:tc>
+        <w:tc>
+          <w:tcPr>
+            <w:tcW w:w="2267" w:type="dxa"/>
+            <w:tcMar>
+              <w:top w:w="80" w:type="dxa"/>
+              <w:left w:w="100" w:type="dxa"/>
+              <w:bottom w:w="80" w:type="dxa"/>
+              <w:right w:w="100" w:type="dxa"/>
+            </w:tcMar>
+            <w:vAlign w:val="center"/>
+          </w:tcPr>
+          <w:p>
+            <w:pPr>
+              <w:spacing w:after="0" w:line="276" w:lineRule="auto"/>
+            </w:pPr>
+            <w:r>
+              <w:rPr>
+                <w:rFonts w:ascii="Times New Roman" w:hAnsi="Times New Roman" w:eastAsia="Times New Roman"/>
+                <w:b w:val="0"/>
+                <w:i w:val="0"/>
+                <w:sz w:val="20"/>
+              </w:rPr>
+              <w:t>AI hỗ trợ rà soát các mục cần sửa và chuẩn hóa cách mô tả repository/workflow.</w:t>
+            </w:r>
+          </w:p>
+        </w:tc>
+        <w:tc>
+          <w:tcPr>
+            <w:tcW w:w="2267" w:type="dxa"/>
+            <w:tcMar>
+              <w:top w:w="80" w:type="dxa"/>
+              <w:left w:w="100" w:type="dxa"/>
+              <w:bottom w:w="80" w:type="dxa"/>
+              <w:right w:w="100" w:type="dxa"/>
+            </w:tcMar>
+            <w:vAlign w:val="center"/>
+          </w:tcPr>
+          <w:p>
+            <w:pPr>
+              <w:spacing w:after="0" w:line="276" w:lineRule="auto"/>
+            </w:pPr>
+            <w:r>
+              <w:rPr>
+                <w:rFonts w:ascii="Times New Roman" w:hAnsi="Times New Roman" w:eastAsia="Times New Roman"/>
+                <w:b w:val="0"/>
+                <w:i w:val="0"/>
+                <w:sz w:val="20"/>
+              </w:rPr>
+              <w:t>Nhóm kiểm tra lại repository và chỉ ghi nhận các việc đã thực hiện.</w:t>
+            </w:r>
+          </w:p>
+        </w:tc>
+      </w:tr>
     </w:tbl>
     <w:p>
       <w:pPr>
@@ -3041,7 +3147,71 @@
           <w:i w:val="0"/>
           <w:sz w:val="26"/>
         </w:rPr>
-        <w:t>Bản phân tích yêu cầu, luồng chính, thiết kế OOP sơ bộ, class diagram, kế hoạch test và cách chia việc đã được chuẩn bị để hai thành viên review. Sau khi thống nhất bản này, nhóm sẽ khóa phạm vi Week 1, tạo repository và chuyển sang implementation trong Week 2.</w:t>
+        <w:t>Bản phân tích yêu cầu, system flow, thiết kế OOP sơ bộ, class diagram, kế hoạch test và cách chia việc đã được hai thành viên thống nhất. Repository GitHub đã được khởi tạo, cả hai thành viên đã tham gia, và các tài liệu Week 1 đã được lưu trong repository. Nhóm sẵn sàng chuyển sang implementation trong Week 2.</w:t>
+      </w:r>
+    </w:p>
+    <w:p>
+      <w:pPr>
+        <w:keepNext/>
+        <w:spacing w:before="200" w:after="100"/>
+        <w:jc w:val="left"/>
+      </w:pPr>
+      <w:r>
+        <w:rPr>
+          <w:rFonts w:ascii="Times New Roman" w:hAnsi="Times New Roman" w:eastAsia="Times New Roman"/>
+          <w:b/>
+          <w:i w:val="0"/>
+          <w:sz w:val="28"/>
+        </w:rPr>
+        <w:t>12. Cập nhật theo phản hồi GVHD</w:t>
+      </w:r>
+    </w:p>
+    <w:p>
+      <w:pPr>
+        <w:spacing w:after="120" w:line="300" w:lineRule="auto"/>
+        <w:ind w:firstLine="432"/>
+        <w:jc w:val="both"/>
+      </w:pPr>
+      <w:r>
+        <w:rPr>
+          <w:rFonts w:ascii="Times New Roman" w:hAnsi="Times New Roman" w:eastAsia="Times New Roman"/>
+          <w:b w:val="0"/>
+          <w:i w:val="0"/>
+          <w:sz w:val="26"/>
+        </w:rPr>
+        <w:t>Sau khi nhận phản hồi của GVHD, nhóm đã bổ sung các nội dung còn thiếu so với cam kết trong báo cáo Week 1:</w:t>
+      </w:r>
+    </w:p>
+    <w:p>
+      <w:pPr>
+        <w:spacing w:after="120" w:line="300" w:lineRule="auto"/>
+        <w:ind w:firstLine="432"/>
+        <w:jc w:val="both"/>
+      </w:pPr>
+      <w:r>
+        <w:rPr>
+          <w:rFonts w:ascii="Times New Roman" w:hAnsi="Times New Roman" w:eastAsia="Times New Roman"/>
+          <w:b w:val="0"/>
+          <w:i w:val="0"/>
+          <w:sz w:val="26"/>
+        </w:rPr>
+        <w:t>- GitHub repository: https://github.com/TuanKhaUTE/oop-elearning-platform</w:t>
+      </w:r>
+    </w:p>
+    <w:p>
+      <w:pPr>
+        <w:spacing w:after="120" w:line="300" w:lineRule="auto"/>
+        <w:ind w:firstLine="432"/>
+        <w:jc w:val="both"/>
+      </w:pPr>
+      <w:r>
+        <w:rPr>
+          <w:rFonts w:ascii="Times New Roman" w:hAnsi="Times New Roman" w:eastAsia="Times New Roman"/>
+          <w:b w:val="0"/>
+          <w:i w:val="0"/>
+          <w:sz w:val="26"/>
+        </w:rPr>
+        <w:t>- Đã bổ sung README, AI Usage Log, workflow/domain contract, cấu trúc source/test/docs và các tài liệu Week 1; cả hai thành viên đã tham gia repository. Main được giữ làm nhánh ổn định, còn implementation bắt đầu ở Week 2 trên các feature branch riêng; nhóm không ghi nhận code chưa thực hiện vào tiến độ Week 1.</w:t>
       </w:r>
     </w:p>
     <w:sectPr>

</xml_diff>